<commit_message>
edited on p test 2 6
</commit_message>
<xml_diff>
--- a/25-26/6th grade/p-test2/p-text2 6.docx
+++ b/25-26/6th grade/p-test2/p-text2 6.docx
@@ -97,60 +97,6 @@
         <w:spacing w:after="0" w:line="240" w:lineRule="auto"/>
         <w:jc w:val="lowKashida"/>
         <w:rPr>
-          <w:rFonts w:ascii="AvantGardeITCbyBT-Medium" w:eastAsia="Times New Roman" w:hAnsi="AvantGardeITCbyBT-Medium" w:cs="Times New Roman"/>
-          <w:color w:val="242021"/>
-          <w:kern w:val="0"/>
-          <w:sz w:val="28"/>
-          <w:szCs w:val="28"/>
-          <w14:ligatures w14:val="none"/>
-        </w:rPr>
-      </w:pPr>
-      <w:r>
-        <w:rPr>
-          <w:rFonts w:ascii="AvantGardeITCbyBT-Medium" w:eastAsia="Times New Roman" w:hAnsi="AvantGardeITCbyBT-Medium" w:cs="Times New Roman"/>
-          <w:color w:val="242021"/>
-          <w:kern w:val="0"/>
-          <w:sz w:val="28"/>
-          <w:szCs w:val="28"/>
-          <w14:ligatures w14:val="none"/>
-        </w:rPr>
-        <w:t>There are seven continents on the Earth. They vary in size and in the numbe</w:t>
-      </w:r>
-      <w:r>
-        <w:rPr>
-          <w:rFonts w:ascii="AvantGardeITCbyBT-Medium" w:eastAsia="Times New Roman" w:hAnsi="AvantGardeITCbyBT-Medium" w:cs="Times New Roman"/>
-          <w:color w:val="242021"/>
-          <w:kern w:val="0"/>
-          <w:sz w:val="28"/>
-          <w:szCs w:val="28"/>
-          <w14:ligatures w14:val="none"/>
-        </w:rPr>
-        <w:t>r</w:t>
-      </w:r>
-      <w:r>
-        <w:rPr>
-          <w:rFonts w:ascii="AvantGardeITCbyBT-Medium" w:eastAsia="Times New Roman" w:hAnsi="AvantGardeITCbyBT-Medium" w:cs="Times New Roman"/>
-          <w:color w:val="242021"/>
-          <w:kern w:val="0"/>
-          <w:sz w:val="28"/>
-          <w:szCs w:val="28"/>
-          <w14:ligatures w14:val="none"/>
-        </w:rPr>
-        <w:t xml:space="preserve"> </w:t>
-      </w:r>
-      <w:r>
-        <w:rPr>
-          <w:rFonts w:ascii="AvantGardeITCbyBT-Medium" w:eastAsia="Times New Roman" w:hAnsi="AvantGardeITCbyBT-Medium" w:cs="Times New Roman"/>
-          <w:color w:val="242021"/>
-          <w:kern w:val="0"/>
-          <w:sz w:val="28"/>
-          <w:szCs w:val="28"/>
-          <w14:ligatures w14:val="none"/>
-        </w:rPr>
-        <w:t>of people.</w:t>
-      </w:r>
-      <w:r>
-        <w:rPr>
           <w:rFonts w:ascii="MyriadPro-Regular" w:eastAsia="Times New Roman" w:hAnsi="MyriadPro-Regular" w:cs="Times New Roman"/>
           <w:color w:val="242021"/>
           <w:kern w:val="0"/>
@@ -158,41 +104,7 @@
           <w:szCs w:val="28"/>
           <w14:ligatures w14:val="none"/>
         </w:rPr>
-        <w:t xml:space="preserve"> </w:t>
-      </w:r>
-      <w:r>
-        <w:rPr>
-          <w:rFonts w:ascii="AvantGardeITCbyBT-Medium" w:eastAsia="Times New Roman" w:hAnsi="AvantGardeITCbyBT-Medium" w:cs="Times New Roman"/>
-          <w:color w:val="242021"/>
-          <w:kern w:val="0"/>
-          <w:sz w:val="28"/>
-          <w:szCs w:val="28"/>
-          <w14:ligatures w14:val="none"/>
-        </w:rPr>
-        <w:t>There are five oceans between these continents.</w:t>
-      </w:r>
-      <w:r>
-        <w:rPr>
-          <w:rFonts w:ascii="AvantGardeITCbyBT-Medium" w:eastAsia="Times New Roman" w:hAnsi="AvantGardeITCbyBT-Medium" w:cs="Times New Roman"/>
-          <w:color w:val="242021"/>
-          <w:kern w:val="0"/>
-          <w:sz w:val="28"/>
-          <w:szCs w:val="28"/>
-          <w14:ligatures w14:val="none"/>
-        </w:rPr>
-        <w:t xml:space="preserve"> </w:t>
-      </w:r>
-      <w:r>
-        <w:rPr>
-          <w:rFonts w:ascii="AvantGardeITCbyBT-Medium" w:eastAsia="Times New Roman" w:hAnsi="AvantGardeITCbyBT-Medium" w:cs="Times New Roman"/>
-          <w:color w:val="242021"/>
-          <w:kern w:val="0"/>
-          <w:sz w:val="28"/>
-          <w:szCs w:val="28"/>
-          <w14:ligatures w14:val="none"/>
-        </w:rPr>
-        <w:t>Russia is the biggest country in the world. It is part of both Europe and Asia.</w:t>
-      </w:r>
+      </w:pPr>
       <w:r>
         <w:rPr>
           <w:rFonts w:ascii="MyriadPro-Regular" w:eastAsia="Times New Roman" w:hAnsi="MyriadPro-Regular" w:cs="Times New Roman"/>
@@ -202,62 +114,205 @@
           <w:szCs w:val="28"/>
           <w14:ligatures w14:val="none"/>
         </w:rPr>
-        <w:t xml:space="preserve"> </w:t>
-      </w:r>
-      <w:r>
-        <w:rPr>
-          <w:rFonts w:ascii="AvantGardeITCbyBT-Medium" w:eastAsia="Times New Roman" w:hAnsi="AvantGardeITCbyBT-Medium" w:cs="Times New Roman"/>
+        <w:t>There are different kinds of natural resources,</w:t>
+      </w:r>
+      <w:r>
+        <w:rPr>
+          <w:rFonts w:ascii="MyriadPro-Regular" w:eastAsia="Times New Roman" w:hAnsi="MyriadPro-Regular" w:cs="Times New Roman"/>
           <w:color w:val="242021"/>
           <w:kern w:val="0"/>
           <w:sz w:val="28"/>
           <w:szCs w:val="28"/>
           <w14:ligatures w14:val="none"/>
         </w:rPr>
-        <w:t>China is the country with the most people. It is located</w:t>
-      </w:r>
-      <w:r>
-        <w:rPr>
-          <w:rFonts w:ascii="AvantGardeITCbyBT-Medium" w:eastAsia="Times New Roman" w:hAnsi="AvantGardeITCbyBT-Medium" w:cs="Times New Roman"/>
+        <w:t xml:space="preserve"> </w:t>
+      </w:r>
+      <w:r>
+        <w:rPr>
+          <w:rFonts w:ascii="MyriadPro-Regular" w:eastAsia="Times New Roman" w:hAnsi="MyriadPro-Regular" w:cs="Times New Roman"/>
           <w:color w:val="242021"/>
           <w:kern w:val="0"/>
           <w:sz w:val="28"/>
           <w:szCs w:val="28"/>
           <w14:ligatures w14:val="none"/>
         </w:rPr>
-        <w:t xml:space="preserve"> </w:t>
-      </w:r>
-      <w:r>
-        <w:rPr>
-          <w:rFonts w:ascii="AvantGardeITCbyBT-Medium" w:eastAsia="Times New Roman" w:hAnsi="AvantGardeITCbyBT-Medium" w:cs="Times New Roman"/>
+        <w:t>but the most important ones that we must</w:t>
+      </w:r>
+      <w:r>
+        <w:rPr>
+          <w:rFonts w:ascii="MyriadPro-Regular" w:eastAsia="Times New Roman" w:hAnsi="MyriadPro-Regular" w:cs="Times New Roman"/>
           <w:color w:val="242021"/>
           <w:kern w:val="0"/>
           <w:sz w:val="28"/>
           <w:szCs w:val="28"/>
           <w14:ligatures w14:val="none"/>
         </w:rPr>
-        <w:t>in East Asia. Chinese is the official language with</w:t>
-      </w:r>
-      <w:r>
-        <w:rPr>
-          <w:rFonts w:ascii="AvantGardeITCbyBT-Medium" w:eastAsia="Times New Roman" w:hAnsi="AvantGardeITCbyBT-Medium" w:cs="Times New Roman"/>
+        <w:t xml:space="preserve"> </w:t>
+      </w:r>
+      <w:r>
+        <w:rPr>
+          <w:rFonts w:ascii="MyriadPro-Regular" w:eastAsia="Times New Roman" w:hAnsi="MyriadPro-Regular" w:cs="Times New Roman"/>
           <w:color w:val="242021"/>
           <w:kern w:val="0"/>
           <w:sz w:val="28"/>
           <w:szCs w:val="28"/>
           <w14:ligatures w14:val="none"/>
         </w:rPr>
-        <w:t xml:space="preserve"> </w:t>
-      </w:r>
-      <w:r>
-        <w:rPr>
-          <w:rFonts w:ascii="AvantGardeITCbyBT-Medium" w:eastAsia="Times New Roman" w:hAnsi="AvantGardeITCbyBT-Medium" w:cs="Times New Roman"/>
+        <w:t>care about are air, soil, forests, water and oil.</w:t>
+      </w:r>
+      <w:r>
+        <w:rPr>
+          <w:rFonts w:ascii="MyriadPro-Regular" w:eastAsia="Times New Roman" w:hAnsi="MyriadPro-Regular" w:cs="Times New Roman"/>
           <w:color w:val="242021"/>
           <w:kern w:val="0"/>
           <w:sz w:val="28"/>
           <w:szCs w:val="28"/>
           <w14:ligatures w14:val="none"/>
         </w:rPr>
-        <w:t>the most native speakers.</w:t>
+        <w:t xml:space="preserve"> </w:t>
+      </w:r>
+      <w:r>
+        <w:rPr>
+          <w:rFonts w:ascii="MyriadPro-Regular" w:eastAsia="Times New Roman" w:hAnsi="MyriadPro-Regular" w:cs="Times New Roman"/>
+          <w:color w:val="242021"/>
+          <w:kern w:val="0"/>
+          <w:sz w:val="28"/>
+          <w:szCs w:val="28"/>
+          <w14:ligatures w14:val="none"/>
+        </w:rPr>
+        <w:t>Clean air is important for all living things to stay</w:t>
+      </w:r>
+      <w:r>
+        <w:rPr>
+          <w:rFonts w:ascii="MyriadPro-Regular" w:eastAsia="Times New Roman" w:hAnsi="MyriadPro-Regular" w:cs="Times New Roman"/>
+          <w:color w:val="242021"/>
+          <w:kern w:val="0"/>
+          <w:sz w:val="28"/>
+          <w:szCs w:val="28"/>
+          <w14:ligatures w14:val="none"/>
+        </w:rPr>
+        <w:t xml:space="preserve"> </w:t>
+      </w:r>
+      <w:r>
+        <w:rPr>
+          <w:rFonts w:ascii="MyriadPro-Regular" w:eastAsia="Times New Roman" w:hAnsi="MyriadPro-Regular" w:cs="Times New Roman"/>
+          <w:color w:val="242021"/>
+          <w:kern w:val="0"/>
+          <w:sz w:val="28"/>
+          <w:szCs w:val="28"/>
+          <w14:ligatures w14:val="none"/>
+        </w:rPr>
+        <w:t>alive. So, we have to work hard to reduce air</w:t>
+      </w:r>
+      <w:r>
+        <w:rPr>
+          <w:rFonts w:ascii="MyriadPro-Regular" w:eastAsia="Times New Roman" w:hAnsi="MyriadPro-Regular" w:cs="Times New Roman"/>
+          <w:color w:val="242021"/>
+          <w:kern w:val="0"/>
+          <w:sz w:val="28"/>
+          <w:szCs w:val="28"/>
+          <w14:ligatures w14:val="none"/>
+        </w:rPr>
+        <w:t xml:space="preserve"> </w:t>
+      </w:r>
+      <w:r>
+        <w:rPr>
+          <w:rFonts w:ascii="MyriadPro-Regular" w:eastAsia="Times New Roman" w:hAnsi="MyriadPro-Regular" w:cs="Times New Roman"/>
+          <w:color w:val="242021"/>
+          <w:kern w:val="0"/>
+          <w:sz w:val="28"/>
+          <w:szCs w:val="28"/>
+          <w14:ligatures w14:val="none"/>
+        </w:rPr>
+        <w:t>pollution. Soil is also very</w:t>
+      </w:r>
+      <w:r>
+        <w:rPr>
+          <w:rFonts w:ascii="MyriadPro-Regular" w:eastAsia="Times New Roman" w:hAnsi="MyriadPro-Regular" w:cs="Times New Roman"/>
+          <w:color w:val="242021"/>
+          <w:kern w:val="0"/>
+          <w:sz w:val="28"/>
+          <w:szCs w:val="28"/>
+          <w14:ligatures w14:val="none"/>
+        </w:rPr>
+        <w:t xml:space="preserve"> </w:t>
+      </w:r>
+      <w:r>
+        <w:rPr>
+          <w:rFonts w:ascii="MyriadPro-Regular" w:eastAsia="Times New Roman" w:hAnsi="MyriadPro-Regular" w:cs="Times New Roman"/>
+          <w:color w:val="242021"/>
+          <w:kern w:val="0"/>
+          <w:sz w:val="28"/>
+          <w:szCs w:val="28"/>
+          <w14:ligatures w14:val="none"/>
+        </w:rPr>
+        <w:t>important because</w:t>
+      </w:r>
+      <w:r>
+        <w:rPr>
+          <w:rFonts w:ascii="MyriadPro-Regular" w:eastAsia="Times New Roman" w:hAnsi="MyriadPro-Regular" w:cs="Times New Roman"/>
+          <w:color w:val="242021"/>
+          <w:kern w:val="0"/>
+          <w:sz w:val="28"/>
+          <w:szCs w:val="28"/>
+          <w14:ligatures w14:val="none"/>
+        </w:rPr>
+        <w:t xml:space="preserve"> </w:t>
+      </w:r>
+      <w:r>
+        <w:rPr>
+          <w:rFonts w:ascii="MyriadPro-Regular" w:eastAsia="Times New Roman" w:hAnsi="MyriadPro-Regular" w:cs="Times New Roman"/>
+          <w:color w:val="242021"/>
+          <w:kern w:val="0"/>
+          <w:sz w:val="28"/>
+          <w:szCs w:val="28"/>
+          <w14:ligatures w14:val="none"/>
+        </w:rPr>
+        <w:t>it helps plants grow.</w:t>
+      </w:r>
+      <w:r>
+        <w:rPr>
+          <w:rFonts w:ascii="MyriadPro-Regular" w:eastAsia="Times New Roman" w:hAnsi="MyriadPro-Regular" w:cs="Times New Roman"/>
+          <w:color w:val="242021"/>
+          <w:kern w:val="0"/>
+          <w:sz w:val="28"/>
+          <w:szCs w:val="28"/>
+          <w14:ligatures w14:val="none"/>
+        </w:rPr>
+        <w:t xml:space="preserve"> </w:t>
+      </w:r>
+      <w:r>
+        <w:rPr>
+          <w:rFonts w:ascii="MyriadPro-Regular" w:eastAsia="Times New Roman" w:hAnsi="MyriadPro-Regular" w:cs="Times New Roman"/>
+          <w:color w:val="242021"/>
+          <w:kern w:val="0"/>
+          <w:sz w:val="28"/>
+          <w:szCs w:val="28"/>
+          <w14:ligatures w14:val="none"/>
+        </w:rPr>
+        <w:t>Everyone must care about water, which is</w:t>
+      </w:r>
+      <w:r>
+        <w:rPr>
+          <w:rFonts w:ascii="MyriadPro-Regular" w:eastAsia="Times New Roman" w:hAnsi="MyriadPro-Regular" w:cs="Times New Roman"/>
+          <w:color w:val="242021"/>
+          <w:kern w:val="0"/>
+          <w:sz w:val="28"/>
+          <w:szCs w:val="28"/>
+          <w14:ligatures w14:val="none"/>
+        </w:rPr>
+        <w:t xml:space="preserve"> </w:t>
+      </w:r>
+      <w:r>
+        <w:rPr>
+          <w:rFonts w:ascii="MyriadPro-Regular" w:eastAsia="Times New Roman" w:hAnsi="MyriadPro-Regular" w:cs="Times New Roman"/>
+          <w:color w:val="242021"/>
+          <w:kern w:val="0"/>
+          <w:sz w:val="28"/>
+          <w:szCs w:val="28"/>
+          <w14:ligatures w14:val="none"/>
+        </w:rPr>
+        <w:t>the main source of life.</w:t>
       </w:r>
     </w:p>
     <w:p>
@@ -305,7 +360,7 @@
           <w:sz w:val="28"/>
           <w:szCs w:val="28"/>
         </w:rPr>
-        <w:t xml:space="preserve">There are </w:t>
+        <w:t xml:space="preserve">There are many different </w:t>
       </w:r>
       <w:proofErr w:type="gramStart"/>
       <w:r>
@@ -315,7 +370,16 @@
           <w:sz w:val="28"/>
           <w:szCs w:val="28"/>
         </w:rPr>
-        <w:t>( five</w:t>
+        <w:t xml:space="preserve">( </w:t>
+      </w:r>
+      <w:r>
+        <w:rPr>
+          <w:b/>
+          <w:bCs/>
+          <w:sz w:val="28"/>
+          <w:szCs w:val="28"/>
+        </w:rPr>
+        <w:t>kinds</w:t>
       </w:r>
       <w:proofErr w:type="gramEnd"/>
       <w:r>
@@ -325,14 +389,32 @@
           <w:sz w:val="28"/>
           <w:szCs w:val="28"/>
         </w:rPr>
-        <w:t xml:space="preserve"> / seven ) </w:t>
-      </w:r>
-      <w:r>
-        <w:rPr>
-          <w:sz w:val="28"/>
-          <w:szCs w:val="28"/>
-        </w:rPr>
-        <w:t>continents in the world.</w:t>
+        <w:t xml:space="preserve">/ </w:t>
+      </w:r>
+      <w:r>
+        <w:rPr>
+          <w:b/>
+          <w:bCs/>
+          <w:sz w:val="28"/>
+          <w:szCs w:val="28"/>
+        </w:rPr>
+        <w:t>materials</w:t>
+      </w:r>
+      <w:r>
+        <w:rPr>
+          <w:b/>
+          <w:bCs/>
+          <w:sz w:val="28"/>
+          <w:szCs w:val="28"/>
+        </w:rPr>
+        <w:t xml:space="preserve"> )</w:t>
+      </w:r>
+      <w:r>
+        <w:rPr>
+          <w:sz w:val="28"/>
+          <w:szCs w:val="28"/>
+        </w:rPr>
+        <w:t xml:space="preserve"> of resources</w:t>
       </w:r>
       <w:r>
         <w:rPr>
@@ -360,12 +442,10 @@
           <w:sz w:val="28"/>
           <w:szCs w:val="28"/>
         </w:rPr>
-        <w:t>The country which has the biggest number of people, is</w:t>
-      </w:r>
-      <w:r>
-        <w:rPr>
-          <w:b/>
-          <w:bCs/>
+        <w:t>Clean air is important for all living things to</w:t>
+      </w:r>
+      <w:r>
+        <w:rPr>
           <w:sz w:val="28"/>
           <w:szCs w:val="28"/>
         </w:rPr>
@@ -379,7 +459,16 @@
           <w:sz w:val="28"/>
           <w:szCs w:val="28"/>
         </w:rPr>
-        <w:t>( Russia</w:t>
+        <w:t xml:space="preserve">( </w:t>
+      </w:r>
+      <w:r>
+        <w:rPr>
+          <w:b/>
+          <w:bCs/>
+          <w:sz w:val="28"/>
+          <w:szCs w:val="28"/>
+        </w:rPr>
+        <w:t>die</w:t>
       </w:r>
       <w:proofErr w:type="gramEnd"/>
       <w:r>
@@ -389,7 +478,25 @@
           <w:sz w:val="28"/>
           <w:szCs w:val="28"/>
         </w:rPr>
-        <w:t xml:space="preserve"> / China ).</w:t>
+        <w:t xml:space="preserve"> /</w:t>
+      </w:r>
+      <w:r>
+        <w:rPr>
+          <w:b/>
+          <w:bCs/>
+          <w:sz w:val="28"/>
+          <w:szCs w:val="28"/>
+        </w:rPr>
+        <w:t xml:space="preserve"> survive</w:t>
+      </w:r>
+      <w:r>
+        <w:rPr>
+          <w:b/>
+          <w:bCs/>
+          <w:sz w:val="28"/>
+          <w:szCs w:val="28"/>
+        </w:rPr>
+        <w:t xml:space="preserve"> ).</w:t>
       </w:r>
     </w:p>
     <w:p>
@@ -410,7 +517,7 @@
           <w:sz w:val="28"/>
           <w:szCs w:val="28"/>
         </w:rPr>
-        <w:t xml:space="preserve">The official language in China </w:t>
+        <w:t xml:space="preserve">The main source of life </w:t>
       </w:r>
       <w:proofErr w:type="gramStart"/>
       <w:r>
@@ -418,7 +525,7 @@
           <w:sz w:val="28"/>
           <w:szCs w:val="28"/>
         </w:rPr>
-        <w:t xml:space="preserve">is </w:t>
+        <w:t>is</w:t>
       </w:r>
       <w:r>
         <w:rPr>
@@ -429,6 +536,13 @@
       </w:r>
       <w:r>
         <w:rPr>
+          <w:sz w:val="28"/>
+          <w:szCs w:val="28"/>
+        </w:rPr>
+        <w:t xml:space="preserve"> </w:t>
+      </w:r>
+      <w:r>
+        <w:rPr>
           <w:b/>
           <w:bCs/>
           <w:sz w:val="28"/>
@@ -453,7 +567,7 @@
           <w:sz w:val="28"/>
           <w:szCs w:val="28"/>
         </w:rPr>
-        <w:t>Chinese</w:t>
+        <w:t>salt</w:t>
       </w:r>
       <w:r>
         <w:rPr>
@@ -471,7 +585,7 @@
           <w:sz w:val="28"/>
           <w:szCs w:val="28"/>
         </w:rPr>
-        <w:t>Russian</w:t>
+        <w:t>water</w:t>
       </w:r>
       <w:r>
         <w:rPr>
@@ -559,14 +673,21 @@
           <w:sz w:val="28"/>
           <w:szCs w:val="28"/>
         </w:rPr>
-        <w:t>There are five oceans in the world</w:t>
-      </w:r>
-      <w:r>
-        <w:rPr>
-          <w:sz w:val="28"/>
-          <w:szCs w:val="28"/>
-        </w:rPr>
-        <w:t>. (……………)</w:t>
+        <w:t>We don't have to work hard to reduce air pollution</w:t>
+      </w:r>
+      <w:r>
+        <w:rPr>
+          <w:sz w:val="28"/>
+          <w:szCs w:val="28"/>
+        </w:rPr>
+        <w:t xml:space="preserve"> (……………)</w:t>
+      </w:r>
+      <w:r>
+        <w:rPr>
+          <w:sz w:val="28"/>
+          <w:szCs w:val="28"/>
+        </w:rPr>
+        <w:t>.</w:t>
       </w:r>
     </w:p>
     <w:p>
@@ -587,14 +708,37 @@
           <w:sz w:val="28"/>
           <w:szCs w:val="28"/>
         </w:rPr>
-        <w:t xml:space="preserve">China is in East Asia. </w:t>
-      </w:r>
-      <w:r>
-        <w:rPr>
-          <w:sz w:val="28"/>
-          <w:szCs w:val="28"/>
-        </w:rPr>
-        <w:t>(…………)</w:t>
+        <w:t xml:space="preserve">Soil is very </w:t>
+      </w:r>
+      <w:proofErr w:type="gramStart"/>
+      <w:r>
+        <w:rPr>
+          <w:sz w:val="28"/>
+          <w:szCs w:val="28"/>
+        </w:rPr>
+        <w:t>important</w:t>
+      </w:r>
+      <w:r>
+        <w:rPr>
+          <w:sz w:val="28"/>
+          <w:szCs w:val="28"/>
+        </w:rPr>
+        <w:t>(</w:t>
+      </w:r>
+      <w:proofErr w:type="gramEnd"/>
+      <w:r>
+        <w:rPr>
+          <w:sz w:val="28"/>
+          <w:szCs w:val="28"/>
+        </w:rPr>
+        <w:t>…………)</w:t>
+      </w:r>
+      <w:r>
+        <w:rPr>
+          <w:sz w:val="28"/>
+          <w:szCs w:val="28"/>
+        </w:rPr>
+        <w:t>.</w:t>
       </w:r>
     </w:p>
     <w:p>
@@ -719,20 +863,13 @@
           <w:u w:val="single"/>
         </w:rPr>
       </w:pPr>
-      <w:r>
-        <w:rPr>
-          <w:sz w:val="28"/>
-          <w:szCs w:val="28"/>
-        </w:rPr>
-        <w:t xml:space="preserve">Habib is Indian. Do you </w:t>
-      </w:r>
       <w:proofErr w:type="gramStart"/>
       <w:r>
         <w:rPr>
           <w:sz w:val="28"/>
           <w:szCs w:val="28"/>
         </w:rPr>
-        <w:t xml:space="preserve">know </w:t>
+        <w:t>Children</w:t>
       </w:r>
       <w:r>
         <w:rPr>
@@ -743,6 +880,13 @@
       </w:r>
       <w:r>
         <w:rPr>
+          <w:sz w:val="28"/>
+          <w:szCs w:val="28"/>
+        </w:rPr>
+        <w:t xml:space="preserve"> </w:t>
+      </w:r>
+      <w:r>
+        <w:rPr>
           <w:b/>
           <w:bCs/>
           <w:sz w:val="28"/>
@@ -758,16 +902,16 @@
           <w:sz w:val="28"/>
           <w:szCs w:val="28"/>
         </w:rPr>
-        <w:t xml:space="preserve"> h</w:t>
-      </w:r>
-      <w:r>
-        <w:rPr>
-          <w:b/>
-          <w:bCs/>
-          <w:sz w:val="28"/>
-          <w:szCs w:val="28"/>
-        </w:rPr>
-        <w:t>er</w:t>
+        <w:t xml:space="preserve"> </w:t>
+      </w:r>
+      <w:r>
+        <w:rPr>
+          <w:b/>
+          <w:bCs/>
+          <w:sz w:val="28"/>
+          <w:szCs w:val="28"/>
+        </w:rPr>
+        <w:t>must</w:t>
       </w:r>
       <w:r>
         <w:rPr>
@@ -785,7 +929,7 @@
           <w:sz w:val="28"/>
           <w:szCs w:val="28"/>
         </w:rPr>
-        <w:t>him</w:t>
+        <w:t>mustn't</w:t>
       </w:r>
       <w:r>
         <w:rPr>
@@ -801,7 +945,14 @@
           <w:sz w:val="28"/>
           <w:szCs w:val="28"/>
         </w:rPr>
-        <w:t>?</w:t>
+        <w:t xml:space="preserve"> </w:t>
+      </w:r>
+      <w:r>
+        <w:rPr>
+          <w:sz w:val="28"/>
+          <w:szCs w:val="28"/>
+        </w:rPr>
+        <w:t>play with matches.</w:t>
       </w:r>
     </w:p>
     <w:p>
@@ -822,7 +973,14 @@
           <w:sz w:val="28"/>
           <w:szCs w:val="28"/>
         </w:rPr>
-        <w:t xml:space="preserve">Tom and </w:t>
+        <w:t>Malak has</w:t>
+      </w:r>
+      <w:r>
+        <w:rPr>
+          <w:sz w:val="28"/>
+          <w:szCs w:val="28"/>
+        </w:rPr>
+        <w:t xml:space="preserve"> </w:t>
       </w:r>
       <w:proofErr w:type="gramStart"/>
       <w:r>
@@ -850,7 +1008,7 @@
           <w:sz w:val="28"/>
           <w:szCs w:val="28"/>
         </w:rPr>
-        <w:t>his</w:t>
+        <w:t>ever</w:t>
       </w:r>
       <w:proofErr w:type="gramEnd"/>
       <w:r>
@@ -860,7 +1018,16 @@
           <w:sz w:val="28"/>
           <w:szCs w:val="28"/>
         </w:rPr>
-        <w:t xml:space="preserve"> / her</w:t>
+        <w:t xml:space="preserve"> / </w:t>
+      </w:r>
+      <w:r>
+        <w:rPr>
+          <w:b/>
+          <w:bCs/>
+          <w:sz w:val="28"/>
+          <w:szCs w:val="28"/>
+        </w:rPr>
+        <w:t>never</w:t>
       </w:r>
       <w:r>
         <w:rPr>
@@ -885,7 +1052,14 @@
           <w:sz w:val="28"/>
           <w:szCs w:val="28"/>
         </w:rPr>
-        <w:t>friend went to the theatre.</w:t>
+        <w:t>ridden a horse</w:t>
+      </w:r>
+      <w:r>
+        <w:rPr>
+          <w:sz w:val="28"/>
+          <w:szCs w:val="28"/>
+        </w:rPr>
+        <w:t>.</w:t>
       </w:r>
     </w:p>
     <w:p>
@@ -907,16 +1081,93 @@
           <w:sz w:val="28"/>
           <w:szCs w:val="28"/>
         </w:rPr>
-        <w:t xml:space="preserve">Those tickets are </w:t>
-      </w:r>
-      <w:r>
-        <w:rPr>
-          <w:b/>
-          <w:bCs/>
-          <w:sz w:val="28"/>
-          <w:szCs w:val="28"/>
-        </w:rPr>
-        <w:t>(our / ours).</w:t>
+        <w:t xml:space="preserve">I haven't seen my </w:t>
+      </w:r>
+      <w:proofErr w:type="gramStart"/>
+      <w:r>
+        <w:rPr>
+          <w:sz w:val="28"/>
+          <w:szCs w:val="28"/>
+        </w:rPr>
+        <w:t xml:space="preserve">uncle </w:t>
+      </w:r>
+      <w:r>
+        <w:rPr>
+          <w:sz w:val="28"/>
+          <w:szCs w:val="28"/>
+        </w:rPr>
+        <w:t xml:space="preserve"> </w:t>
+      </w:r>
+      <w:r>
+        <w:rPr>
+          <w:b/>
+          <w:bCs/>
+          <w:sz w:val="28"/>
+          <w:szCs w:val="28"/>
+        </w:rPr>
+        <w:t>(</w:t>
+      </w:r>
+      <w:proofErr w:type="gramEnd"/>
+      <w:r>
+        <w:rPr>
+          <w:b/>
+          <w:bCs/>
+          <w:sz w:val="28"/>
+          <w:szCs w:val="28"/>
+        </w:rPr>
+        <w:t>since</w:t>
+      </w:r>
+      <w:r>
+        <w:rPr>
+          <w:b/>
+          <w:bCs/>
+          <w:sz w:val="28"/>
+          <w:szCs w:val="28"/>
+        </w:rPr>
+        <w:t xml:space="preserve"> / </w:t>
+      </w:r>
+      <w:r>
+        <w:rPr>
+          <w:b/>
+          <w:bCs/>
+          <w:sz w:val="28"/>
+          <w:szCs w:val="28"/>
+        </w:rPr>
+        <w:t>for</w:t>
+      </w:r>
+      <w:r>
+        <w:rPr>
+          <w:b/>
+          <w:bCs/>
+          <w:sz w:val="28"/>
+          <w:szCs w:val="28"/>
+        </w:rPr>
+        <w:t>)</w:t>
+      </w:r>
+      <w:r>
+        <w:rPr>
+          <w:b/>
+          <w:bCs/>
+          <w:sz w:val="28"/>
+          <w:szCs w:val="28"/>
+        </w:rPr>
+        <w:t xml:space="preserve"> </w:t>
+      </w:r>
+      <w:r>
+        <w:rPr>
+          <w:sz w:val="28"/>
+          <w:szCs w:val="28"/>
+        </w:rPr>
+        <w:t>2016</w:t>
+      </w:r>
+      <w:r>
+        <w:rPr>
+          <w:b/>
+          <w:bCs/>
+          <w:sz w:val="28"/>
+          <w:szCs w:val="28"/>
+        </w:rPr>
+        <w:t>.</w:t>
       </w:r>
       <w:r>
         <w:rPr>
@@ -945,26 +1196,31 @@
           <w:sz w:val="28"/>
           <w:szCs w:val="28"/>
         </w:rPr>
+        <w:t xml:space="preserve">We are </w:t>
+      </w:r>
+      <w:proofErr w:type="gramStart"/>
+      <w:r>
+        <w:rPr>
+          <w:sz w:val="28"/>
+          <w:szCs w:val="28"/>
+        </w:rPr>
+        <w:t xml:space="preserve">small </w:t>
+      </w:r>
+      <w:r>
+        <w:rPr>
+          <w:sz w:val="28"/>
+          <w:szCs w:val="28"/>
+        </w:rPr>
         <w:t xml:space="preserve"> </w:t>
       </w:r>
-      <w:proofErr w:type="gramStart"/>
-      <w:r>
-        <w:rPr>
-          <w:b/>
-          <w:bCs/>
-          <w:sz w:val="28"/>
-          <w:szCs w:val="28"/>
-        </w:rPr>
-        <w:t xml:space="preserve">( </w:t>
-      </w:r>
-      <w:r>
-        <w:rPr>
-          <w:b/>
-          <w:bCs/>
-          <w:sz w:val="28"/>
-          <w:szCs w:val="28"/>
-        </w:rPr>
-        <w:t>dunia</w:t>
+      <w:r>
+        <w:rPr>
+          <w:b/>
+          <w:bCs/>
+          <w:sz w:val="28"/>
+          <w:szCs w:val="28"/>
+        </w:rPr>
+        <w:t>(</w:t>
       </w:r>
       <w:proofErr w:type="gramEnd"/>
       <w:r>
@@ -974,6 +1230,24 @@
           <w:sz w:val="28"/>
           <w:szCs w:val="28"/>
         </w:rPr>
+        <w:t xml:space="preserve"> </w:t>
+      </w:r>
+      <w:r>
+        <w:rPr>
+          <w:b/>
+          <w:bCs/>
+          <w:sz w:val="28"/>
+          <w:szCs w:val="28"/>
+        </w:rPr>
+        <w:t>so</w:t>
+      </w:r>
+      <w:r>
+        <w:rPr>
+          <w:b/>
+          <w:bCs/>
+          <w:sz w:val="28"/>
+          <w:szCs w:val="28"/>
+        </w:rPr>
         <w:t xml:space="preserve"> / </w:t>
       </w:r>
       <w:r>
@@ -983,7 +1257,7 @@
           <w:sz w:val="28"/>
           <w:szCs w:val="28"/>
         </w:rPr>
-        <w:t>Dunia</w:t>
+        <w:t>but</w:t>
       </w:r>
       <w:r>
         <w:rPr>
@@ -1008,7 +1282,7 @@
           <w:sz w:val="28"/>
           <w:szCs w:val="28"/>
         </w:rPr>
-        <w:t>is my best friend</w:t>
+        <w:t>strong</w:t>
       </w:r>
     </w:p>
     <w:p>
@@ -1025,19 +1299,15 @@
           <w:u w:val="single"/>
         </w:rPr>
       </w:pPr>
-      <w:r>
-        <w:rPr>
-          <w:sz w:val="28"/>
-          <w:szCs w:val="28"/>
-        </w:rPr>
-        <w:t>W</w:t>
-      </w:r>
-      <w:r>
-        <w:rPr>
-          <w:sz w:val="28"/>
-          <w:szCs w:val="28"/>
-        </w:rPr>
-        <w:t>here is your ticket please</w:t>
+      <w:proofErr w:type="gramStart"/>
+      <w:r>
+        <w:rPr>
+          <w:b/>
+          <w:bCs/>
+          <w:sz w:val="28"/>
+          <w:szCs w:val="28"/>
+        </w:rPr>
+        <w:t>(</w:t>
       </w:r>
       <w:r>
         <w:rPr>
@@ -1048,16 +1318,16 @@
         </w:rPr>
         <w:t xml:space="preserve"> </w:t>
       </w:r>
-      <w:proofErr w:type="gramStart"/>
-      <w:r>
-        <w:rPr>
-          <w:b/>
-          <w:bCs/>
-          <w:sz w:val="28"/>
-          <w:szCs w:val="28"/>
-        </w:rPr>
-        <w:t>(</w:t>
-      </w:r>
+      <w:r>
+        <w:rPr>
+          <w:b/>
+          <w:bCs/>
+          <w:sz w:val="28"/>
+          <w:szCs w:val="28"/>
+        </w:rPr>
+        <w:t>Natural</w:t>
+      </w:r>
+      <w:proofErr w:type="gramEnd"/>
       <w:r>
         <w:rPr>
           <w:b/>
@@ -1074,6 +1344,15 @@
           <w:sz w:val="28"/>
           <w:szCs w:val="28"/>
         </w:rPr>
+        <w:t xml:space="preserve"> /</w:t>
+      </w:r>
+      <w:r>
+        <w:rPr>
+          <w:b/>
+          <w:bCs/>
+          <w:sz w:val="28"/>
+          <w:szCs w:val="28"/>
+        </w:rPr>
         <w:t xml:space="preserve"> </w:t>
       </w:r>
       <w:r>
@@ -1083,16 +1362,6 @@
           <w:sz w:val="28"/>
           <w:szCs w:val="28"/>
         </w:rPr>
-        <w:t>.</w:t>
-      </w:r>
-      <w:proofErr w:type="gramEnd"/>
-      <w:r>
-        <w:rPr>
-          <w:b/>
-          <w:bCs/>
-          <w:sz w:val="28"/>
-          <w:szCs w:val="28"/>
-        </w:rPr>
         <w:t xml:space="preserve"> </w:t>
       </w:r>
       <w:r>
@@ -1102,7 +1371,7 @@
           <w:sz w:val="28"/>
           <w:szCs w:val="28"/>
         </w:rPr>
-        <w:t xml:space="preserve"> /</w:t>
+        <w:t>Healthy</w:t>
       </w:r>
       <w:r>
         <w:rPr>
@@ -1120,25 +1389,14 @@
           <w:sz w:val="28"/>
           <w:szCs w:val="28"/>
         </w:rPr>
-        <w:t xml:space="preserve"> </w:t>
-      </w:r>
-      <w:r>
-        <w:rPr>
-          <w:b/>
-          <w:bCs/>
-          <w:sz w:val="28"/>
-          <w:szCs w:val="28"/>
-        </w:rPr>
-        <w:t xml:space="preserve">? </w:t>
-      </w:r>
-      <w:r>
-        <w:rPr>
-          <w:b/>
-          <w:bCs/>
-          <w:sz w:val="28"/>
-          <w:szCs w:val="28"/>
-        </w:rPr>
         <w:t xml:space="preserve"> ) </w:t>
+      </w:r>
+      <w:r>
+        <w:rPr>
+          <w:sz w:val="28"/>
+          <w:szCs w:val="28"/>
+        </w:rPr>
+        <w:t xml:space="preserve">resources are found in the environment </w:t>
       </w:r>
     </w:p>
     <w:p>
@@ -1276,7 +1534,7 @@
                 <w:sz w:val="28"/>
                 <w:szCs w:val="28"/>
               </w:rPr>
-              <w:t>open</w:t>
+              <w:t>live</w:t>
             </w:r>
           </w:p>
         </w:tc>
@@ -1306,7 +1564,7 @@
                 <w:sz w:val="28"/>
                 <w:szCs w:val="28"/>
               </w:rPr>
-              <w:t>follow</w:t>
+              <w:t>helps</w:t>
             </w:r>
           </w:p>
         </w:tc>
@@ -1336,7 +1594,7 @@
                 <w:sz w:val="28"/>
                 <w:szCs w:val="28"/>
               </w:rPr>
-              <w:t>protect</w:t>
+              <w:t>plant</w:t>
             </w:r>
           </w:p>
         </w:tc>
@@ -1366,7 +1624,7 @@
                 <w:sz w:val="28"/>
                 <w:szCs w:val="28"/>
               </w:rPr>
-              <w:t>watch</w:t>
+              <w:t>resources</w:t>
             </w:r>
           </w:p>
         </w:tc>
@@ -1421,7 +1679,14 @@
           <w:sz w:val="28"/>
           <w:szCs w:val="28"/>
         </w:rPr>
-        <w:t>When you want to…………</w:t>
+        <w:t>Soil is very important because it</w:t>
+      </w:r>
+      <w:r>
+        <w:rPr>
+          <w:sz w:val="28"/>
+          <w:szCs w:val="28"/>
+        </w:rPr>
+        <w:t>…………</w:t>
       </w:r>
       <w:r>
         <w:rPr>
@@ -1435,7 +1700,14 @@
           <w:sz w:val="28"/>
           <w:szCs w:val="28"/>
         </w:rPr>
-        <w:t>.. a play in the theatre, you have to get a ticket first.</w:t>
+        <w:t xml:space="preserve">.. </w:t>
+      </w:r>
+      <w:r>
+        <w:rPr>
+          <w:sz w:val="28"/>
+          <w:szCs w:val="28"/>
+        </w:rPr>
+        <w:t>plants grow.</w:t>
       </w:r>
     </w:p>
     <w:p>
@@ -1457,7 +1729,7 @@
           <w:sz w:val="28"/>
           <w:szCs w:val="28"/>
         </w:rPr>
-        <w:t>You sit quietly until curtains</w:t>
+        <w:t xml:space="preserve">Air, soil, forests and water are natural </w:t>
       </w:r>
       <w:r>
         <w:rPr>
@@ -1479,6 +1751,13 @@
           <w:szCs w:val="28"/>
         </w:rPr>
         <w:t>…..</w:t>
+      </w:r>
+      <w:r>
+        <w:rPr>
+          <w:sz w:val="28"/>
+          <w:szCs w:val="28"/>
+        </w:rPr>
+        <w:t>.</w:t>
       </w:r>
       <w:r>
         <w:rPr>
@@ -1507,7 +1786,14 @@
           <w:sz w:val="28"/>
           <w:szCs w:val="28"/>
         </w:rPr>
-        <w:t>We should…………….</w:t>
+        <w:t xml:space="preserve">All living things need water and air to </w:t>
+      </w:r>
+      <w:r>
+        <w:rPr>
+          <w:sz w:val="28"/>
+          <w:szCs w:val="28"/>
+        </w:rPr>
+        <w:t>…………….</w:t>
       </w:r>
       <w:r>
         <w:rPr>
@@ -1521,7 +1807,7 @@
           <w:sz w:val="28"/>
           <w:szCs w:val="28"/>
         </w:rPr>
-        <w:t>the rules and laws</w:t>
+        <w:t>.....</w:t>
       </w:r>
     </w:p>
     <w:p>
@@ -1543,7 +1829,14 @@
           <w:sz w:val="28"/>
           <w:szCs w:val="28"/>
         </w:rPr>
-        <w:t>We should……………</w:t>
+        <w:t xml:space="preserve">People should </w:t>
+      </w:r>
+      <w:r>
+        <w:rPr>
+          <w:sz w:val="28"/>
+          <w:szCs w:val="28"/>
+        </w:rPr>
+        <w:t>……………</w:t>
       </w:r>
       <w:r>
         <w:rPr>
@@ -1557,7 +1850,7 @@
           <w:sz w:val="28"/>
           <w:szCs w:val="28"/>
         </w:rPr>
-        <w:t>the environment</w:t>
+        <w:t>trees</w:t>
       </w:r>
     </w:p>
     <w:p>
@@ -1679,7 +1972,7 @@
                 <w:sz w:val="28"/>
                 <w:szCs w:val="28"/>
               </w:rPr>
-              <w:t>Stage</w:t>
+              <w:t>Don’t worry.</w:t>
             </w:r>
           </w:p>
         </w:tc>
@@ -1706,7 +1999,7 @@
                 <w:sz w:val="28"/>
                 <w:szCs w:val="28"/>
               </w:rPr>
-              <w:t>special clothes which players wear.</w:t>
+              <w:t>in the city centre.</w:t>
             </w:r>
           </w:p>
         </w:tc>
@@ -1738,7 +2031,7 @@
                 <w:sz w:val="28"/>
                 <w:szCs w:val="28"/>
               </w:rPr>
-              <w:t>costumes</w:t>
+              <w:t>I have tasted the lemon.</w:t>
             </w:r>
           </w:p>
         </w:tc>
@@ -1765,7 +2058,7 @@
                 <w:sz w:val="28"/>
                 <w:szCs w:val="28"/>
               </w:rPr>
-              <w:t>people who watch a play.</w:t>
+              <w:t>the same rights.</w:t>
             </w:r>
           </w:p>
         </w:tc>
@@ -1797,7 +2090,7 @@
                 <w:sz w:val="28"/>
                 <w:szCs w:val="28"/>
               </w:rPr>
-              <w:t>to direct</w:t>
+              <w:t>I bought the bag from the market</w:t>
             </w:r>
           </w:p>
         </w:tc>
@@ -1824,7 +2117,14 @@
                 <w:sz w:val="28"/>
                 <w:szCs w:val="28"/>
               </w:rPr>
-              <w:t>where actresses and actors act.</w:t>
+              <w:t>t</w:t>
+            </w:r>
+            <w:r>
+              <w:rPr>
+                <w:sz w:val="28"/>
+                <w:szCs w:val="28"/>
+              </w:rPr>
+              <w:t>hings will be OK.</w:t>
             </w:r>
           </w:p>
         </w:tc>
@@ -1853,7 +2153,7 @@
                 <w:sz w:val="28"/>
                 <w:szCs w:val="28"/>
               </w:rPr>
-              <w:t>audience</w:t>
+              <w:t>All people have</w:t>
             </w:r>
           </w:p>
         </w:tc>
@@ -1880,7 +2180,7 @@
                 <w:sz w:val="28"/>
                 <w:szCs w:val="28"/>
               </w:rPr>
-              <w:t>to guide and give instructions.</w:t>
+              <w:t>It’s sour.</w:t>
             </w:r>
           </w:p>
         </w:tc>
@@ -2050,7 +2350,7 @@
           <w:sz w:val="28"/>
           <w:szCs w:val="28"/>
         </w:rPr>
-        <w:t>Where are you from</w:t>
+        <w:t>How long have you had your bag</w:t>
       </w:r>
       <w:r>
         <w:rPr>
@@ -2095,14 +2395,7 @@
           <w:sz w:val="28"/>
           <w:szCs w:val="28"/>
         </w:rPr>
-        <w:t xml:space="preserve">What is your </w:t>
-      </w:r>
-      <w:r>
-        <w:rPr>
-          <w:sz w:val="28"/>
-          <w:szCs w:val="28"/>
-        </w:rPr>
-        <w:t>nationality</w:t>
+        <w:t>Have you ever been to a Sunday market</w:t>
       </w:r>
       <w:r>
         <w:rPr>
@@ -2527,12 +2820,13 @@
           <w:pPr>
             <w:pStyle w:val="ad"/>
             <w:rPr>
+              <w:rFonts w:hint="cs"/>
               <w:b/>
               <w:bCs/>
               <w:sz w:val="28"/>
               <w:szCs w:val="28"/>
               <w:rtl/>
-              <w:lang w:bidi="ar-SY"/>
+              <w:lang w:bidi="ar-AE"/>
             </w:rPr>
           </w:pPr>
           <w:r>
@@ -2545,7 +2839,19 @@
               <w:rtl/>
               <w:lang w:bidi="ar-SY"/>
             </w:rPr>
-            <w:t>مذاكرة الفصل الاول</w:t>
+            <w:t>مذاكرة الفصل ال</w:t>
+          </w:r>
+          <w:r>
+            <w:rPr>
+              <w:rFonts w:hint="cs"/>
+              <w:b/>
+              <w:bCs/>
+              <w:sz w:val="28"/>
+              <w:szCs w:val="28"/>
+              <w:rtl/>
+              <w:lang w:bidi="ar-AE"/>
+            </w:rPr>
+            <w:t>ثاني</w:t>
           </w:r>
         </w:p>
       </w:tc>
@@ -2605,7 +2911,19 @@
               <w:rtl/>
               <w:lang w:bidi="ar-SY"/>
             </w:rPr>
-            <w:t>الخامس</w:t>
+            <w:t>ال</w:t>
+          </w:r>
+          <w:r>
+            <w:rPr>
+              <w:rFonts w:hint="cs"/>
+              <w:b/>
+              <w:bCs/>
+              <w:sz w:val="28"/>
+              <w:szCs w:val="28"/>
+              <w:rtl/>
+              <w:lang w:bidi="ar-SY"/>
+            </w:rPr>
+            <w:t>سادس</w:t>
           </w:r>
           <w:r>
             <w:rPr>
@@ -2726,6 +3044,18 @@
               <w:lang w:bidi="ar-SY"/>
             </w:rPr>
             <w:t xml:space="preserve">المادة: </w:t>
+          </w:r>
+          <w:r>
+            <w:rPr>
+              <w:rFonts w:hint="cs"/>
+              <w:b/>
+              <w:bCs/>
+              <w:sz w:val="28"/>
+              <w:szCs w:val="28"/>
+              <w:rtl/>
+              <w:lang w:bidi="ar-SY"/>
+            </w:rPr>
+            <w:t>اللغة الإنكليزية</w:t>
           </w:r>
         </w:p>
       </w:tc>
@@ -4086,7 +4416,6 @@
   <w:style w:type="character" w:default="1" w:styleId="a0">
     <w:name w:val="Default Paragraph Font"/>
     <w:uiPriority w:val="1"/>
-    <w:semiHidden/>
     <w:unhideWhenUsed/>
   </w:style>
   <w:style w:type="table" w:default="1" w:styleId="a1">

</xml_diff>